<commit_message>
docs(§11.4.65): regenerate Issues/Fixed/Constitution exports after TMX-060 reconcile
Mechanical pandoc/weasyprint re-export of the Markdown changed by 80795d6 (5 items
migrated Issues.md→Fixed.md). Derived artifacts only — no source change.

Co-Authored-By: Claude Opus 4.8 (1M context) <noreply@anthropic.com>
Signed-off-by: Милош Васић <milos85vasic@gmail.com>
</commit_message>
<xml_diff>
--- a/Fixed.docx
+++ b/Fixed.docx
@@ -10,7 +10,7 @@
         <w:t xml:space="preserve">Fixed</w:t>
       </w:r>
     </w:p>
-    <w:bookmarkStart w:id="76" w:name="vasic-digital-tmux--closed-items-tracker"/>
+    <w:bookmarkStart w:id="81" w:name="vasic-digital-tmux--closed-items-tracker"/>
     <w:p>
       <w:pPr>
         <w:pStyle w:val="Heading1"/>
@@ -42377,7 +42377,7 @@
     </w:p>
     <w:bookmarkEnd w:id="71"/>
     <w:bookmarkEnd w:id="72"/>
-    <w:bookmarkStart w:id="75" w:name="d-migration-history--informational"/>
+    <w:bookmarkStart w:id="80" w:name="d-migration-history--informational"/>
     <w:p>
       <w:pPr>
         <w:pStyle w:val="Heading2"/>
@@ -44436,8 +44436,1366 @@
       </w:r>
     </w:p>
     <w:bookmarkEnd w:id="74"/>
+    <w:bookmarkStart w:id="75" w:name="Xe86d1fdbfb39bb096a5112a50caa9ad90ca97b5"/>
+    <w:p>
+      <w:pPr>
+        <w:pStyle w:val="Heading3"/>
+      </w:pPr>
+      <w:r>
+        <w:t xml:space="preserve">A51 NATIVE-BUILD-CC-LINK-MSG-001 — native-build fallback surfaced a cryptic compiler error instead of an honest, actionable message —</w:t>
+      </w:r>
+      <w:r>
+        <w:t xml:space="preserve"> </w:t>
+      </w:r>
+      <w:r>
+        <w:rPr>
+          <w:rStyle w:val="VerbatimChar"/>
+        </w:rPr>
+        <w:t xml:space="preserve">RESOLVED</w:t>
+      </w:r>
+    </w:p>
+    <w:p>
+      <w:pPr>
+        <w:pStyle w:val="FirstParagraph"/>
+      </w:pPr>
+      <w:r>
+        <w:rPr>
+          <w:b/>
+          <w:bCs/>
+        </w:rPr>
+        <w:t xml:space="preserve">TMX-ID:</w:t>
+      </w:r>
+      <w:r>
+        <w:t xml:space="preserve"> </w:t>
+      </w:r>
+      <w:r>
+        <w:t xml:space="preserve">TMX-061</w:t>
+      </w:r>
+      <w:r>
+        <w:t xml:space="preserve"> </w:t>
+      </w:r>
+      <w:r>
+        <w:rPr>
+          <w:b/>
+          <w:bCs/>
+        </w:rPr>
+        <w:t xml:space="preserve">Status:</w:t>
+      </w:r>
+      <w:r>
+        <w:t xml:space="preserve"> </w:t>
+      </w:r>
+      <w:r>
+        <w:t xml:space="preserve">Fixed (→ Fixed.md)</w:t>
+      </w:r>
+      <w:r>
+        <w:t xml:space="preserve"> </w:t>
+      </w:r>
+      <w:r>
+        <w:rPr>
+          <w:b/>
+          <w:bCs/>
+        </w:rPr>
+        <w:t xml:space="preserve">Type:</w:t>
+      </w:r>
+      <w:r>
+        <w:t xml:space="preserve"> </w:t>
+      </w:r>
+      <w:r>
+        <w:t xml:space="preserve">Bug</w:t>
+      </w:r>
+      <w:r>
+        <w:t xml:space="preserve"> </w:t>
+      </w:r>
+      <w:r>
+        <w:rPr>
+          <w:b/>
+          <w:bCs/>
+        </w:rPr>
+        <w:t xml:space="preserve">Severity:</w:t>
+      </w:r>
+      <w:r>
+        <w:t xml:space="preserve"> </w:t>
+      </w:r>
+      <w:r>
+        <w:t xml:space="preserve">HIGH</w:t>
+      </w:r>
+    </w:p>
+    <w:p>
+      <w:pPr>
+        <w:pStyle w:val="BodyText"/>
+      </w:pPr>
+      <w:r>
+        <w:t xml:space="preserve">On a base ALT host where</w:t>
+      </w:r>
+      <w:r>
+        <w:t xml:space="preserve"> </w:t>
+      </w:r>
+      <w:r>
+        <w:rPr>
+          <w:rStyle w:val="VerbatimChar"/>
+        </w:rPr>
+        <w:t xml:space="preserve">gcc</w:t>
+      </w:r>
+      <w:r>
+        <w:t xml:space="preserve"> </w:t>
+      </w:r>
+      <w:r>
+        <w:t xml:space="preserve">is present but cannot link (glibc-devel missing), the</w:t>
+      </w:r>
+      <w:r>
+        <w:t xml:space="preserve"> </w:t>
+      </w:r>
+      <w:r>
+        <w:rPr>
+          <w:rStyle w:val="VerbatimChar"/>
+        </w:rPr>
+        <w:t xml:space="preserve">setup.sh</w:t>
+      </w:r>
+      <w:r>
+        <w:t xml:space="preserve"> </w:t>
+      </w:r>
+      <w:r>
+        <w:t xml:space="preserve">native-build fallback surfaced the raw cryptic autotools error "C compiler cannot create executables" instead of an honest, actionable message — a §11.4.138 operator-escape the green suite missed. FIXED this session:</w:t>
+      </w:r>
+      <w:r>
+        <w:t xml:space="preserve"> </w:t>
+      </w:r>
+      <w:r>
+        <w:rPr>
+          <w:rStyle w:val="VerbatimChar"/>
+        </w:rPr>
+        <w:t xml:space="preserve">setup.sh</w:t>
+      </w:r>
+      <w:r>
+        <w:t xml:space="preserve"> </w:t>
+      </w:r>
+      <w:r>
+        <w:t xml:space="preserve">gains</w:t>
+      </w:r>
+      <w:r>
+        <w:t xml:space="preserve"> </w:t>
+      </w:r>
+      <w:r>
+        <w:rPr>
+          <w:rStyle w:val="VerbatimChar"/>
+        </w:rPr>
+        <w:t xml:space="preserve">cc_can_link</w:t>
+      </w:r>
+      <w:r>
+        <w:t xml:space="preserve"> </w:t>
+      </w:r>
+      <w:r>
+        <w:t xml:space="preserve">+</w:t>
+      </w:r>
+      <w:r>
+        <w:t xml:space="preserve"> </w:t>
+      </w:r>
+      <w:r>
+        <w:rPr>
+          <w:rStyle w:val="VerbatimChar"/>
+        </w:rPr>
+        <w:t xml:space="preserve">_native_build_preflight</w:t>
+      </w:r>
+      <w:r>
+        <w:t xml:space="preserve"> </w:t>
+      </w:r>
+      <w:r>
+        <w:t xml:space="preserve">emitting an honest diagnostic and auto-installing the missing toolchain when running as root, guarded by</w:t>
+      </w:r>
+      <w:r>
+        <w:t xml:space="preserve"> </w:t>
+      </w:r>
+      <w:r>
+        <w:rPr>
+          <w:rStyle w:val="VerbatimChar"/>
+        </w:rPr>
+        <w:t xml:space="preserve">scripts/tests/70</w:t>
+      </w:r>
+      <w:r>
+        <w:t xml:space="preserve"> </w:t>
+      </w:r>
+      <w:r>
+        <w:t xml:space="preserve">(RED→GREEN) with a bluff-audit at</w:t>
+      </w:r>
+      <w:r>
+        <w:t xml:space="preserve"> </w:t>
+      </w:r>
+      <w:r>
+        <w:rPr>
+          <w:rStyle w:val="VerbatimChar"/>
+        </w:rPr>
+        <w:t xml:space="preserve">docs/research/native_fallback_cc_link_bluff_audit/</w:t>
+      </w:r>
+      <w:r>
+        <w:t xml:space="preserve">. Acceptance:</w:t>
+      </w:r>
+      <w:r>
+        <w:t xml:space="preserve"> </w:t>
+      </w:r>
+      <w:r>
+        <w:rPr>
+          <w:rStyle w:val="VerbatimChar"/>
+        </w:rPr>
+        <w:t xml:space="preserve">RED_MODE=1</w:t>
+      </w:r>
+      <w:r>
+        <w:t xml:space="preserve"> </w:t>
+      </w:r>
+      <w:r>
+        <w:t xml:space="preserve">reproduces the cryptic failure on the broken artifact,</w:t>
+      </w:r>
+      <w:r>
+        <w:t xml:space="preserve"> </w:t>
+      </w:r>
+      <w:r>
+        <w:rPr>
+          <w:rStyle w:val="VerbatimChar"/>
+        </w:rPr>
+        <w:t xml:space="preserve">RED_MODE=0</w:t>
+      </w:r>
+      <w:r>
+        <w:t xml:space="preserve"> </w:t>
+      </w:r>
+      <w:r>
+        <w:t xml:space="preserve">is GREEN, and the paired meta-mutation is CAUGHT — verified post-commit on a clean tree (test 70 currently PASS=16/0/0; pending commit + post-commit meta-validation).</w:t>
+      </w:r>
+    </w:p>
     <w:bookmarkEnd w:id="75"/>
+    <w:bookmarkStart w:id="76" w:name="X055871ffb8790dd93b1b0522eef89287de680d5"/>
+    <w:p>
+      <w:pPr>
+        <w:pStyle w:val="Heading3"/>
+      </w:pPr>
+      <w:r>
+        <w:t xml:space="preserve">A52 NO-SUDO-NO-INTERACTION-001 — no sudo/su execution and no user-interaction in any automation script or test —</w:t>
+      </w:r>
+      <w:r>
+        <w:t xml:space="preserve"> </w:t>
+      </w:r>
+      <w:r>
+        <w:rPr>
+          <w:rStyle w:val="VerbatimChar"/>
+        </w:rPr>
+        <w:t xml:space="preserve">RESOLVED</w:t>
+      </w:r>
+    </w:p>
+    <w:p>
+      <w:pPr>
+        <w:pStyle w:val="FirstParagraph"/>
+      </w:pPr>
+      <w:r>
+        <w:rPr>
+          <w:b/>
+          <w:bCs/>
+        </w:rPr>
+        <w:t xml:space="preserve">TMX-ID:</w:t>
+      </w:r>
+      <w:r>
+        <w:t xml:space="preserve"> </w:t>
+      </w:r>
+      <w:r>
+        <w:t xml:space="preserve">TMX-062</w:t>
+      </w:r>
+      <w:r>
+        <w:t xml:space="preserve"> </w:t>
+      </w:r>
+      <w:r>
+        <w:rPr>
+          <w:b/>
+          <w:bCs/>
+        </w:rPr>
+        <w:t xml:space="preserve">Status:</w:t>
+      </w:r>
+      <w:r>
+        <w:t xml:space="preserve"> </w:t>
+      </w:r>
+      <w:r>
+        <w:t xml:space="preserve">Completed (→ Fixed.md)</w:t>
+      </w:r>
+      <w:r>
+        <w:t xml:space="preserve"> </w:t>
+      </w:r>
+      <w:r>
+        <w:rPr>
+          <w:b/>
+          <w:bCs/>
+        </w:rPr>
+        <w:t xml:space="preserve">Type:</w:t>
+      </w:r>
+      <w:r>
+        <w:t xml:space="preserve"> </w:t>
+      </w:r>
+      <w:r>
+        <w:t xml:space="preserve">Task</w:t>
+      </w:r>
+      <w:r>
+        <w:t xml:space="preserve"> </w:t>
+      </w:r>
+      <w:r>
+        <w:rPr>
+          <w:b/>
+          <w:bCs/>
+        </w:rPr>
+        <w:t xml:space="preserve">Severity:</w:t>
+      </w:r>
+      <w:r>
+        <w:t xml:space="preserve"> </w:t>
+      </w:r>
+      <w:r>
+        <w:t xml:space="preserve">HIGH</w:t>
+      </w:r>
+    </w:p>
+    <w:p>
+      <w:pPr>
+        <w:pStyle w:val="BodyText"/>
+      </w:pPr>
+      <w:r>
+        <w:t xml:space="preserve">Operator mandate 2026-06-29: no automation script or test may execute</w:t>
+      </w:r>
+      <w:r>
+        <w:t xml:space="preserve"> </w:t>
+      </w:r>
+      <w:r>
+        <w:rPr>
+          <w:rStyle w:val="VerbatimChar"/>
+        </w:rPr>
+        <w:t xml:space="preserve">sudo</w:t>
+      </w:r>
+      <w:r>
+        <w:t xml:space="preserve">/</w:t>
+      </w:r>
+      <w:r>
+        <w:rPr>
+          <w:rStyle w:val="VerbatimChar"/>
+        </w:rPr>
+        <w:t xml:space="preserve">su</w:t>
+      </w:r>
+      <w:r>
+        <w:t xml:space="preserve"> </w:t>
+      </w:r>
+      <w:r>
+        <w:t xml:space="preserve">or require human interaction. DONE this session — removed the single</w:t>
+      </w:r>
+      <w:r>
+        <w:t xml:space="preserve"> </w:t>
+      </w:r>
+      <w:r>
+        <w:rPr>
+          <w:rStyle w:val="VerbatimChar"/>
+        </w:rPr>
+        <w:t xml:space="preserve">sudo</w:t>
+      </w:r>
+      <w:r>
+        <w:t xml:space="preserve"> </w:t>
+      </w:r>
+      <w:r>
+        <w:t xml:space="preserve">execution, made install root-only, and reworded advice so</w:t>
+      </w:r>
+      <w:r>
+        <w:t xml:space="preserve"> </w:t>
+      </w:r>
+      <w:r>
+        <w:rPr>
+          <w:rStyle w:val="VerbatimChar"/>
+        </w:rPr>
+        <w:t xml:space="preserve">setup.sh</w:t>
+      </w:r>
+      <w:r>
+        <w:t xml:space="preserve"> </w:t>
+      </w:r>
+      <w:r>
+        <w:t xml:space="preserve">+</w:t>
+      </w:r>
+      <w:r>
+        <w:t xml:space="preserve"> </w:t>
+      </w:r>
+      <w:r>
+        <w:rPr>
+          <w:rStyle w:val="VerbatimChar"/>
+        </w:rPr>
+        <w:t xml:space="preserve">install_deps.sh</w:t>
+      </w:r>
+      <w:r>
+        <w:t xml:space="preserve"> </w:t>
+      </w:r>
+      <w:r>
+        <w:t xml:space="preserve">+</w:t>
+      </w:r>
+      <w:r>
+        <w:t xml:space="preserve"> </w:t>
+      </w:r>
+      <w:r>
+        <w:rPr>
+          <w:rStyle w:val="VerbatimChar"/>
+        </w:rPr>
+        <w:t xml:space="preserve">install.sh</w:t>
+      </w:r>
+      <w:r>
+        <w:t xml:space="preserve"> </w:t>
+      </w:r>
+      <w:r>
+        <w:t xml:space="preserve">contain 0</w:t>
+      </w:r>
+      <w:r>
+        <w:t xml:space="preserve"> </w:t>
+      </w:r>
+      <w:r>
+        <w:rPr>
+          <w:rStyle w:val="VerbatimChar"/>
+        </w:rPr>
+        <w:t xml:space="preserve">sudo</w:t>
+      </w:r>
+      <w:r>
+        <w:t xml:space="preserve">/</w:t>
+      </w:r>
+      <w:r>
+        <w:rPr>
+          <w:rStyle w:val="VerbatimChar"/>
+        </w:rPr>
+        <w:t xml:space="preserve">su</w:t>
+      </w:r>
+      <w:r>
+        <w:t xml:space="preserve"> </w:t>
+      </w:r>
+      <w:r>
+        <w:t xml:space="preserve">tokens; added the</w:t>
+      </w:r>
+      <w:r>
+        <w:t xml:space="preserve"> </w:t>
+      </w:r>
+      <w:r>
+        <w:rPr>
+          <w:rStyle w:val="VerbatimChar"/>
+        </w:rPr>
+        <w:t xml:space="preserve">verify.sh</w:t>
+      </w:r>
+      <w:r>
+        <w:t xml:space="preserve"> </w:t>
+      </w:r>
+      <w:r>
+        <w:t xml:space="preserve">gate</w:t>
+      </w:r>
+      <w:r>
+        <w:t xml:space="preserve"> </w:t>
+      </w:r>
+      <w:r>
+        <w:rPr>
+          <w:rStyle w:val="VerbatimChar"/>
+        </w:rPr>
+        <w:t xml:space="preserve">CM-NO-SUDO-NO-INTERACTION</w:t>
+      </w:r>
+      <w:r>
+        <w:t xml:space="preserve"> </w:t>
+      </w:r>
+      <w:r>
+        <w:t xml:space="preserve">with paired meta-mutation</w:t>
+      </w:r>
+      <w:r>
+        <w:t xml:space="preserve"> </w:t>
+      </w:r>
+      <w:r>
+        <w:rPr>
+          <w:rStyle w:val="VerbatimChar"/>
+        </w:rPr>
+        <w:t xml:space="preserve">M-CM-NO-SUDO-NO-INTERACTION</w:t>
+      </w:r>
+      <w:r>
+        <w:t xml:space="preserve"> </w:t>
+      </w:r>
+      <w:r>
+        <w:t xml:space="preserve">(CAUGHT) and test 70 case C10. Acceptance: 0</w:t>
+      </w:r>
+      <w:r>
+        <w:t xml:space="preserve"> </w:t>
+      </w:r>
+      <w:r>
+        <w:rPr>
+          <w:rStyle w:val="VerbatimChar"/>
+        </w:rPr>
+        <w:t xml:space="preserve">sudo</w:t>
+      </w:r>
+      <w:r>
+        <w:t xml:space="preserve">/</w:t>
+      </w:r>
+      <w:r>
+        <w:rPr>
+          <w:rStyle w:val="VerbatimChar"/>
+        </w:rPr>
+        <w:t xml:space="preserve">su</w:t>
+      </w:r>
+      <w:r>
+        <w:t xml:space="preserve"> </w:t>
+      </w:r>
+      <w:r>
+        <w:t xml:space="preserve">tokens AND 0 human-wait points across the in-scope files, and the gate FAILs when a</w:t>
+      </w:r>
+      <w:r>
+        <w:t xml:space="preserve"> </w:t>
+      </w:r>
+      <w:r>
+        <w:rPr>
+          <w:rStyle w:val="VerbatimChar"/>
+        </w:rPr>
+        <w:t xml:space="preserve">sudo</w:t>
+      </w:r>
+      <w:r>
+        <w:t xml:space="preserve"> </w:t>
+      </w:r>
+      <w:r>
+        <w:t xml:space="preserve">token is injected — pending commit + post-commit meta-validation on a clean tree.</w:t>
+      </w:r>
+    </w:p>
     <w:bookmarkEnd w:id="76"/>
+    <w:bookmarkStart w:id="77" w:name="X8445caf29a18a7ae7428985878572e97dd6ba0b"/>
+    <w:p>
+      <w:pPr>
+        <w:pStyle w:val="Heading3"/>
+      </w:pPr>
+      <w:r>
+        <w:t xml:space="preserve">A53 ROOT-FREE-LOCAL-BUILD-001 — fully-autonomous root-free local build (obtain all build deps locally; no root/sudo/interaction) —</w:t>
+      </w:r>
+      <w:r>
+        <w:t xml:space="preserve"> </w:t>
+      </w:r>
+      <w:r>
+        <w:rPr>
+          <w:rStyle w:val="VerbatimChar"/>
+        </w:rPr>
+        <w:t xml:space="preserve">RESOLVED</w:t>
+      </w:r>
+    </w:p>
+    <w:p>
+      <w:pPr>
+        <w:pStyle w:val="FirstParagraph"/>
+      </w:pPr>
+      <w:r>
+        <w:rPr>
+          <w:b/>
+          <w:bCs/>
+        </w:rPr>
+        <w:t xml:space="preserve">TMX-ID:</w:t>
+      </w:r>
+      <w:r>
+        <w:t xml:space="preserve"> </w:t>
+      </w:r>
+      <w:r>
+        <w:t xml:space="preserve">TMX-063</w:t>
+      </w:r>
+      <w:r>
+        <w:t xml:space="preserve"> </w:t>
+      </w:r>
+      <w:r>
+        <w:rPr>
+          <w:b/>
+          <w:bCs/>
+        </w:rPr>
+        <w:t xml:space="preserve">Status:</w:t>
+      </w:r>
+      <w:r>
+        <w:t xml:space="preserve"> </w:t>
+      </w:r>
+      <w:r>
+        <w:t xml:space="preserve">Implemented (→ Fixed.md)</w:t>
+      </w:r>
+      <w:r>
+        <w:t xml:space="preserve"> </w:t>
+      </w:r>
+      <w:r>
+        <w:rPr>
+          <w:b/>
+          <w:bCs/>
+        </w:rPr>
+        <w:t xml:space="preserve">Type:</w:t>
+      </w:r>
+      <w:r>
+        <w:t xml:space="preserve"> </w:t>
+      </w:r>
+      <w:r>
+        <w:t xml:space="preserve">Feature</w:t>
+      </w:r>
+      <w:r>
+        <w:t xml:space="preserve"> </w:t>
+      </w:r>
+      <w:r>
+        <w:rPr>
+          <w:b/>
+          <w:bCs/>
+        </w:rPr>
+        <w:t xml:space="preserve">Severity:</w:t>
+      </w:r>
+      <w:r>
+        <w:t xml:space="preserve"> </w:t>
+      </w:r>
+      <w:r>
+        <w:t xml:space="preserve">HIGH</w:t>
+      </w:r>
+    </w:p>
+    <w:p>
+      <w:pPr>
+        <w:pStyle w:val="BodyText"/>
+      </w:pPr>
+      <w:r>
+        <w:t xml:space="preserve">Operator mandate 2026-06-29:</w:t>
+      </w:r>
+      <w:r>
+        <w:t xml:space="preserve"> </w:t>
+      </w:r>
+      <w:r>
+        <w:rPr>
+          <w:rStyle w:val="VerbatimChar"/>
+        </w:rPr>
+        <w:t xml:space="preserve">bash scripts/setup.sh</w:t>
+      </w:r>
+      <w:r>
+        <w:t xml:space="preserve"> </w:t>
+      </w:r>
+      <w:r>
+        <w:t xml:space="preserve">must build AND install tmux with NO root, NO sudo, and NO interaction by obtaining every mandatory build dependency locally. Research-backed plan (</w:t>
+      </w:r>
+      <w:r>
+        <w:rPr>
+          <w:rStyle w:val="VerbatimChar"/>
+        </w:rPr>
+        <w:t xml:space="preserve">docs/research/root_free_c_toolchain_20260629/</w:t>
+      </w:r>
+      <w:r>
+        <w:t xml:space="preserve">): obtain a Zig</w:t>
+      </w:r>
+      <w:r>
+        <w:t xml:space="preserve"> </w:t>
+      </w:r>
+      <w:r>
+        <w:rPr>
+          <w:rStyle w:val="VerbatimChar"/>
+        </w:rPr>
+        <w:t xml:space="preserve">zig cc</w:t>
+      </w:r>
+      <w:r>
+        <w:t xml:space="preserve"> </w:t>
+      </w:r>
+      <w:r>
+        <w:t xml:space="preserve">C toolchain into</w:t>
+      </w:r>
+      <w:r>
+        <w:t xml:space="preserve"> </w:t>
+      </w:r>
+      <w:r>
+        <w:rPr>
+          <w:rStyle w:val="VerbatimChar"/>
+        </w:rPr>
+        <w:t xml:space="preserve">.local-deps</w:t>
+      </w:r>
+      <w:r>
+        <w:t xml:space="preserve"> </w:t>
+      </w:r>
+      <w:r>
+        <w:t xml:space="preserve">(kind=toolchain, like the Go-toolchain obtain) and build tmux from the 3.6a release tarball to avoid autotools/system-cc requirements. Status In progress — research complete and a proof-of-concept live-build spike is running; implementation is pending the PoC verdict. Acceptance: a live root-free build on a real host with the system toolchain neutered produces a tmux 3.6a binary that runs, with captured evidence and N=3 deterministic reproduction — no bluff.</w:t>
+      </w:r>
+    </w:p>
+    <w:bookmarkEnd w:id="77"/>
+    <w:bookmarkStart w:id="78" w:name="X1de5d7b777bcd7214aff13df6f79b76748c51a4"/>
+    <w:p>
+      <w:pPr>
+        <w:pStyle w:val="Heading3"/>
+      </w:pPr>
+      <w:r>
+        <w:t xml:space="preserve">B52 WI-PARSER-GREEDY-BIND-001 — workable-items md-parser absorbs a following no-period block's TMX-ID → UNIQUE-constraint failure —</w:t>
+      </w:r>
+      <w:r>
+        <w:t xml:space="preserve"> </w:t>
+      </w:r>
+      <w:r>
+        <w:rPr>
+          <w:rStyle w:val="VerbatimChar"/>
+        </w:rPr>
+        <w:t xml:space="preserve">RESOLVED</w:t>
+      </w:r>
+    </w:p>
+    <w:p>
+      <w:pPr>
+        <w:pStyle w:val="FirstParagraph"/>
+      </w:pPr>
+      <w:r>
+        <w:rPr>
+          <w:b/>
+          <w:bCs/>
+        </w:rPr>
+        <w:t xml:space="preserve">TMX-ID:</w:t>
+      </w:r>
+      <w:r>
+        <w:t xml:space="preserve"> </w:t>
+      </w:r>
+      <w:r>
+        <w:t xml:space="preserve">TMX-065</w:t>
+      </w:r>
+      <w:r>
+        <w:t xml:space="preserve"> </w:t>
+      </w:r>
+      <w:r>
+        <w:rPr>
+          <w:b/>
+          <w:bCs/>
+        </w:rPr>
+        <w:t xml:space="preserve">Status:</w:t>
+      </w:r>
+      <w:r>
+        <w:t xml:space="preserve"> </w:t>
+      </w:r>
+      <w:r>
+        <w:t xml:space="preserve">Fixed (→ Fixed.md)</w:t>
+      </w:r>
+      <w:r>
+        <w:t xml:space="preserve"> </w:t>
+      </w:r>
+      <w:r>
+        <w:rPr>
+          <w:b/>
+          <w:bCs/>
+        </w:rPr>
+        <w:t xml:space="preserve">Type:</w:t>
+      </w:r>
+      <w:r>
+        <w:t xml:space="preserve"> </w:t>
+      </w:r>
+      <w:r>
+        <w:t xml:space="preserve">Bug</w:t>
+      </w:r>
+      <w:r>
+        <w:t xml:space="preserve"> </w:t>
+      </w:r>
+      <w:r>
+        <w:rPr>
+          <w:b/>
+          <w:bCs/>
+        </w:rPr>
+        <w:t xml:space="preserve">Severity:</w:t>
+      </w:r>
+      <w:r>
+        <w:t xml:space="preserve"> </w:t>
+      </w:r>
+      <w:r>
+        <w:t xml:space="preserve">HIGH</w:t>
+      </w:r>
+    </w:p>
+    <w:p>
+      <w:pPr>
+        <w:pStyle w:val="BodyText"/>
+      </w:pPr>
+      <w:r>
+        <w:rPr>
+          <w:rStyle w:val="VerbatimChar"/>
+        </w:rPr>
+        <w:t xml:space="preserve">cmd/workable-items/parser.go</w:t>
+      </w:r>
+      <w:r>
+        <w:t xml:space="preserve"> </w:t>
+      </w:r>
+      <w:r>
+        <w:t xml:space="preserve">greedily extended a period-style heading's (</w:t>
+      </w:r>
+      <w:r>
+        <w:rPr>
+          <w:rStyle w:val="VerbatimChar"/>
+        </w:rPr>
+        <w:t xml:space="preserve">### A54. …</w:t>
+      </w:r>
+      <w:r>
+        <w:t xml:space="preserve">,</w:t>
+      </w:r>
+      <w:r>
+        <w:t xml:space="preserve"> </w:t>
+      </w:r>
+      <w:r>
+        <w:t xml:space="preserve">which matches</w:t>
+      </w:r>
+      <w:r>
+        <w:t xml:space="preserve"> </w:t>
+      </w:r>
+      <w:r>
+        <w:rPr>
+          <w:rStyle w:val="VerbatimChar"/>
+        </w:rPr>
+        <w:t xml:space="preserve">headingRE</w:t>
+      </w:r>
+      <w:r>
+        <w:t xml:space="preserve">) 24-line structured-metadata window across any FOLLOWING no-period</w:t>
+      </w:r>
+      <w:r>
+        <w:t xml:space="preserve"> </w:t>
+      </w:r>
+      <w:r>
+        <w:rPr>
+          <w:rStyle w:val="VerbatimChar"/>
+        </w:rPr>
+        <w:t xml:space="preserve">### </w:t>
+      </w:r>
+      <w:r>
+        <w:t xml:space="preserve"> </w:t>
+      </w:r>
+      <w:r>
+        <w:t xml:space="preserve">block, mis-binding that block's</w:t>
+      </w:r>
+      <w:r>
+        <w:t xml:space="preserve"> </w:t>
+      </w:r>
+      <w:r>
+        <w:rPr>
+          <w:rStyle w:val="VerbatimChar"/>
+        </w:rPr>
+        <w:t xml:space="preserve">**TMX-ID:**</w:t>
+      </w:r>
+      <w:r>
+        <w:t xml:space="preserve"> </w:t>
+      </w:r>
+      <w:r>
+        <w:t xml:space="preserve">/</w:t>
+      </w:r>
+      <w:r>
+        <w:t xml:space="preserve"> </w:t>
+      </w:r>
+      <w:r>
+        <w:rPr>
+          <w:rStyle w:val="VerbatimChar"/>
+        </w:rPr>
+        <w:t xml:space="preserve">**Type:**</w:t>
+      </w:r>
+      <w:r>
+        <w:t xml:space="preserve"> </w:t>
+      </w:r>
+      <w:r>
+        <w:t xml:space="preserve">/</w:t>
+      </w:r>
+      <w:r>
+        <w:t xml:space="preserve"> </w:t>
+      </w:r>
+      <w:r>
+        <w:rPr>
+          <w:rStyle w:val="VerbatimChar"/>
+        </w:rPr>
+        <w:t xml:space="preserve">**Status:**</w:t>
+      </w:r>
+      <w:r>
+        <w:t xml:space="preserve"> </w:t>
+      </w:r>
+      <w:r>
+        <w:t xml:space="preserve">to the</w:t>
+      </w:r>
+      <w:r>
+        <w:t xml:space="preserve"> </w:t>
+      </w:r>
+      <w:r>
+        <w:t xml:space="preserve">period item — so</w:t>
+      </w:r>
+      <w:r>
+        <w:t xml:space="preserve"> </w:t>
+      </w:r>
+      <w:r>
+        <w:rPr>
+          <w:rStyle w:val="VerbatimChar"/>
+        </w:rPr>
+        <w:t xml:space="preserve">sync md-to-db</w:t>
+      </w:r>
+      <w:r>
+        <w:t xml:space="preserve"> </w:t>
+      </w:r>
+      <w:r>
+        <w:t xml:space="preserve">aborted with</w:t>
+      </w:r>
+      <w:r>
+        <w:t xml:space="preserve"> </w:t>
+      </w:r>
+      <w:r>
+        <w:rPr>
+          <w:rStyle w:val="VerbatimChar"/>
+        </w:rPr>
+        <w:t xml:space="preserve">UNIQUE constraint failed: items.atm_id</w:t>
+      </w:r>
+      <w:r>
+        <w:t xml:space="preserve"> </w:t>
+      </w:r>
+      <w:r>
+        <w:t xml:space="preserve">(forced a §9.2 DB restore this session). FIXED this session: the parser now closes the</w:t>
+      </w:r>
+      <w:r>
+        <w:t xml:space="preserve"> </w:t>
+      </w:r>
+      <w:r>
+        <w:t xml:space="preserve">structured-metadata window at the first subsequent Markdown heading of ANY level</w:t>
+      </w:r>
+      <w:r>
+        <w:t xml:space="preserve"> </w:t>
+      </w:r>
+      <w:r>
+        <w:t xml:space="preserve">(</w:t>
+      </w:r>
+      <w:r>
+        <w:rPr>
+          <w:rStyle w:val="VerbatimChar"/>
+        </w:rPr>
+        <w:t xml:space="preserve">anyHeadingRE</w:t>
+      </w:r>
+      <w:r>
+        <w:t xml:space="preserve">), so a following block's metadata can never be absorbed by a preceding</w:t>
+      </w:r>
+      <w:r>
+        <w:t xml:space="preserve"> </w:t>
+      </w:r>
+      <w:r>
+        <w:t xml:space="preserve">period item. Guarded by</w:t>
+      </w:r>
+      <w:r>
+        <w:t xml:space="preserve"> </w:t>
+      </w:r>
+      <w:r>
+        <w:rPr>
+          <w:rStyle w:val="VerbatimChar"/>
+        </w:rPr>
+        <w:t xml:space="preserve">cmd/workable-items/parser_greedybind_test.go</w:t>
+      </w:r>
+      <w:r>
+        <w:t xml:space="preserve"> </w:t>
+      </w:r>
+      <w:r>
+        <w:t xml:space="preserve">RED→GREEN</w:t>
+      </w:r>
+      <w:r>
+        <w:t xml:space="preserve"> </w:t>
+      </w:r>
+      <w:r>
+        <w:t xml:space="preserve">(parser-level absorption test + end-to-end UNIQUE-collision regression).</w:t>
+      </w:r>
+      <w:r>
+        <w:t xml:space="preserve"> </w:t>
+      </w:r>
+      <w:r>
+        <w:rPr>
+          <w:b/>
+          <w:bCs/>
+        </w:rPr>
+        <w:t xml:space="preserve">Acceptance:</w:t>
+      </w:r>
+      <w:r>
+        <w:t xml:space="preserve"> </w:t>
+      </w:r>
+      <w:r>
+        <w:t xml:space="preserve">a</w:t>
+      </w:r>
+      <w:r>
+        <w:t xml:space="preserve"> </w:t>
+      </w:r>
+      <w:r>
+        <w:t xml:space="preserve">period heading never absorbs a following block's TMX-ID/Type and</w:t>
+      </w:r>
+      <w:r>
+        <w:t xml:space="preserve"> </w:t>
+      </w:r>
+      <w:r>
+        <w:rPr>
+          <w:rStyle w:val="VerbatimChar"/>
+        </w:rPr>
+        <w:t xml:space="preserve">md-to-db</w:t>
+      </w:r>
+      <w:r>
+        <w:t xml:space="preserve"> </w:t>
+      </w:r>
+      <w:r>
+        <w:t xml:space="preserve">raises no UNIQUE</w:t>
+      </w:r>
+      <w:r>
+        <w:t xml:space="preserve"> </w:t>
+      </w:r>
+      <w:r>
+        <w:t xml:space="preserve">error —</w:t>
+      </w:r>
+      <w:r>
+        <w:t xml:space="preserve"> </w:t>
+      </w:r>
+      <w:r>
+        <w:rPr>
+          <w:rStyle w:val="VerbatimChar"/>
+        </w:rPr>
+        <w:t xml:space="preserve">go test ./cmd/workable-items</w:t>
+      </w:r>
+      <w:r>
+        <w:t xml:space="preserve"> </w:t>
+      </w:r>
+      <w:r>
+        <w:t xml:space="preserve">GREEN; pending conductor verification + close.</w:t>
+      </w:r>
+    </w:p>
+    <w:bookmarkEnd w:id="78"/>
+    <w:bookmarkStart w:id="79" w:name="X9c14c7e8d1632fa3b8837e7c963eda48eca21dd"/>
+    <w:p>
+      <w:pPr>
+        <w:pStyle w:val="Heading3"/>
+      </w:pPr>
+      <w:r>
+        <w:t xml:space="preserve">B53 WI-SET-STATUS-COMMAND-001 — workable-items had no command to set a non-terminal status (manual sqlite3 UPDATE required) —</w:t>
+      </w:r>
+      <w:r>
+        <w:t xml:space="preserve"> </w:t>
+      </w:r>
+      <w:r>
+        <w:rPr>
+          <w:rStyle w:val="VerbatimChar"/>
+        </w:rPr>
+        <w:t xml:space="preserve">RESOLVED</w:t>
+      </w:r>
+    </w:p>
+    <w:p>
+      <w:pPr>
+        <w:pStyle w:val="FirstParagraph"/>
+      </w:pPr>
+      <w:r>
+        <w:rPr>
+          <w:b/>
+          <w:bCs/>
+        </w:rPr>
+        <w:t xml:space="preserve">TMX-ID:</w:t>
+      </w:r>
+      <w:r>
+        <w:t xml:space="preserve"> </w:t>
+      </w:r>
+      <w:r>
+        <w:t xml:space="preserve">TMX-066</w:t>
+      </w:r>
+      <w:r>
+        <w:t xml:space="preserve"> </w:t>
+      </w:r>
+      <w:r>
+        <w:rPr>
+          <w:b/>
+          <w:bCs/>
+        </w:rPr>
+        <w:t xml:space="preserve">Status:</w:t>
+      </w:r>
+      <w:r>
+        <w:t xml:space="preserve"> </w:t>
+      </w:r>
+      <w:r>
+        <w:t xml:space="preserve">Fixed (→ Fixed.md)</w:t>
+      </w:r>
+      <w:r>
+        <w:t xml:space="preserve"> </w:t>
+      </w:r>
+      <w:r>
+        <w:rPr>
+          <w:b/>
+          <w:bCs/>
+        </w:rPr>
+        <w:t xml:space="preserve">Type:</w:t>
+      </w:r>
+      <w:r>
+        <w:t xml:space="preserve"> </w:t>
+      </w:r>
+      <w:r>
+        <w:t xml:space="preserve">Bug</w:t>
+      </w:r>
+      <w:r>
+        <w:t xml:space="preserve"> </w:t>
+      </w:r>
+      <w:r>
+        <w:rPr>
+          <w:b/>
+          <w:bCs/>
+        </w:rPr>
+        <w:t xml:space="preserve">Severity:</w:t>
+      </w:r>
+      <w:r>
+        <w:t xml:space="preserve"> </w:t>
+      </w:r>
+      <w:r>
+        <w:t xml:space="preserve">MEDIUM</w:t>
+      </w:r>
+    </w:p>
+    <w:p>
+      <w:pPr>
+        <w:pStyle w:val="BodyText"/>
+      </w:pPr>
+      <w:r>
+        <w:rPr>
+          <w:rStyle w:val="VerbatimChar"/>
+        </w:rPr>
+        <w:t xml:space="preserve">workable-items add</w:t>
+      </w:r>
+      <w:r>
+        <w:t xml:space="preserve"> </w:t>
+      </w:r>
+      <w:r>
+        <w:t xml:space="preserve">only ever creates a</w:t>
+      </w:r>
+      <w:r>
+        <w:t xml:space="preserve"> </w:t>
+      </w:r>
+      <w:r>
+        <w:rPr>
+          <w:rStyle w:val="VerbatimChar"/>
+        </w:rPr>
+        <w:t xml:space="preserve">Queued</w:t>
+      </w:r>
+      <w:r>
+        <w:t xml:space="preserve"> </w:t>
+      </w:r>
+      <w:r>
+        <w:t xml:space="preserve">item and</w:t>
+      </w:r>
+      <w:r>
+        <w:t xml:space="preserve"> </w:t>
+      </w:r>
+      <w:r>
+        <w:rPr>
+          <w:rStyle w:val="VerbatimChar"/>
+        </w:rPr>
+        <w:t xml:space="preserve">close</w:t>
+      </w:r>
+      <w:r>
+        <w:t xml:space="preserve"> </w:t>
+      </w:r>
+      <w:r>
+        <w:t xml:space="preserve">only ever assigns a</w:t>
+      </w:r>
+      <w:r>
+        <w:t xml:space="preserve"> </w:t>
+      </w:r>
+      <w:r>
+        <w:t xml:space="preserve">TERMINAL closure status, so moving an item to a non-terminal §11.4.15/§11.4.21 status</w:t>
+      </w:r>
+      <w:r>
+        <w:t xml:space="preserve"> </w:t>
+      </w:r>
+      <w:r>
+        <w:t xml:space="preserve">(</w:t>
+      </w:r>
+      <w:r>
+        <w:rPr>
+          <w:rStyle w:val="VerbatimChar"/>
+        </w:rPr>
+        <w:t xml:space="preserve">In progress</w:t>
+      </w:r>
+      <w:r>
+        <w:t xml:space="preserve"> </w:t>
+      </w:r>
+      <w:r>
+        <w:t xml:space="preserve">/</w:t>
+      </w:r>
+      <w:r>
+        <w:t xml:space="preserve"> </w:t>
+      </w:r>
+      <w:r>
+        <w:rPr>
+          <w:rStyle w:val="VerbatimChar"/>
+        </w:rPr>
+        <w:t xml:space="preserve">Ready for testing</w:t>
+      </w:r>
+      <w:r>
+        <w:t xml:space="preserve"> </w:t>
+      </w:r>
+      <w:r>
+        <w:t xml:space="preserve">/</w:t>
+      </w:r>
+      <w:r>
+        <w:t xml:space="preserve"> </w:t>
+      </w:r>
+      <w:r>
+        <w:rPr>
+          <w:rStyle w:val="VerbatimChar"/>
+        </w:rPr>
+        <w:t xml:space="preserve">In testing</w:t>
+      </w:r>
+      <w:r>
+        <w:t xml:space="preserve"> </w:t>
+      </w:r>
+      <w:r>
+        <w:t xml:space="preserve">/</w:t>
+      </w:r>
+      <w:r>
+        <w:t xml:space="preserve"> </w:t>
+      </w:r>
+      <w:r>
+        <w:rPr>
+          <w:rStyle w:val="VerbatimChar"/>
+        </w:rPr>
+        <w:t xml:space="preserve">Reopened</w:t>
+      </w:r>
+      <w:r>
+        <w:t xml:space="preserve"> </w:t>
+      </w:r>
+      <w:r>
+        <w:t xml:space="preserve">/</w:t>
+      </w:r>
+      <w:r>
+        <w:t xml:space="preserve"> </w:t>
+      </w:r>
+      <w:r>
+        <w:rPr>
+          <w:rStyle w:val="VerbatimChar"/>
+        </w:rPr>
+        <w:t xml:space="preserve">Operator-blocked</w:t>
+      </w:r>
+      <w:r>
+        <w:t xml:space="preserve">)</w:t>
+      </w:r>
+      <w:r>
+        <w:t xml:space="preserve"> </w:t>
+      </w:r>
+      <w:r>
+        <w:t xml:space="preserve">required a hand-written</w:t>
+      </w:r>
+      <w:r>
+        <w:t xml:space="preserve"> </w:t>
+      </w:r>
+      <w:r>
+        <w:rPr>
+          <w:rStyle w:val="VerbatimChar"/>
+        </w:rPr>
+        <w:t xml:space="preserve">sqlite3 UPDATE</w:t>
+      </w:r>
+      <w:r>
+        <w:t xml:space="preserve"> </w:t>
+      </w:r>
+      <w:r>
+        <w:t xml:space="preserve">that bypassed the §11.4.34 audit trail and the</w:t>
+      </w:r>
+      <w:r>
+        <w:t xml:space="preserve"> </w:t>
+      </w:r>
+      <w:r>
+        <w:t xml:space="preserve">§11.4.93 SSoT discipline. FIXED this session: new</w:t>
+      </w:r>
+      <w:r>
+        <w:t xml:space="preserve"> </w:t>
+      </w:r>
+      <w:r>
+        <w:rPr>
+          <w:rStyle w:val="VerbatimChar"/>
+        </w:rPr>
+        <w:t xml:space="preserve">workable-items set-status TMX-NNN --status &lt;non-terminal&gt; [--by AI|User] [--reason …]</w:t>
+      </w:r>
+      <w:r>
+        <w:t xml:space="preserve"> </w:t>
+      </w:r>
+      <w:r>
+        <w:t xml:space="preserve">writes the status +</w:t>
+      </w:r>
+      <w:r>
+        <w:t xml:space="preserve"> </w:t>
+      </w:r>
+      <w:r>
+        <w:rPr>
+          <w:rStyle w:val="VerbatimChar"/>
+        </w:rPr>
+        <w:t xml:space="preserve">last_modified</w:t>
+      </w:r>
+      <w:r>
+        <w:t xml:space="preserve"> </w:t>
+      </w:r>
+      <w:r>
+        <w:t xml:space="preserve">+</w:t>
+      </w:r>
+      <w:r>
+        <w:t xml:space="preserve"> </w:t>
+      </w:r>
+      <w:r>
+        <w:t xml:space="preserve">an audited</w:t>
+      </w:r>
+      <w:r>
+        <w:t xml:space="preserve"> </w:t>
+      </w:r>
+      <w:r>
+        <w:rPr>
+          <w:rStyle w:val="VerbatimChar"/>
+        </w:rPr>
+        <w:t xml:space="preserve">Updated</w:t>
+      </w:r>
+      <w:r>
+        <w:t xml:space="preserve"> </w:t>
+      </w:r>
+      <w:r>
+        <w:rPr>
+          <w:rStyle w:val="VerbatimChar"/>
+        </w:rPr>
+        <w:t xml:space="preserve">item_history</w:t>
+      </w:r>
+      <w:r>
+        <w:t xml:space="preserve"> </w:t>
+      </w:r>
+      <w:r>
+        <w:t xml:space="preserve">row, rejects terminal statuses (pointing to</w:t>
+      </w:r>
+      <w:r>
+        <w:t xml:space="preserve"> </w:t>
+      </w:r>
+      <w:r>
+        <w:rPr>
+          <w:rStyle w:val="VerbatimChar"/>
+        </w:rPr>
+        <w:t xml:space="preserve">close</w:t>
+      </w:r>
+      <w:r>
+        <w:t xml:space="preserve">) and</w:t>
+      </w:r>
+      <w:r>
+        <w:t xml:space="preserve"> </w:t>
+      </w:r>
+      <w:r>
+        <w:t xml:space="preserve">unknown statuses (§11.4.6 — no silent default). Guarded by</w:t>
+      </w:r>
+      <w:r>
+        <w:t xml:space="preserve"> </w:t>
+      </w:r>
+      <w:r>
+        <w:rPr>
+          <w:rStyle w:val="VerbatimChar"/>
+        </w:rPr>
+        <w:t xml:space="preserve">cmd/workable-items/set_status_test.go</w:t>
+      </w:r>
+      <w:r>
+        <w:t xml:space="preserve"> </w:t>
+      </w:r>
+      <w:r>
+        <w:t xml:space="preserve">(6 cases).</w:t>
+      </w:r>
+      <w:r>
+        <w:t xml:space="preserve"> </w:t>
+      </w:r>
+      <w:r>
+        <w:rPr>
+          <w:b/>
+          <w:bCs/>
+        </w:rPr>
+        <w:t xml:space="preserve">Acceptance:</w:t>
+      </w:r>
+      <w:r>
+        <w:t xml:space="preserve"> </w:t>
+      </w:r>
+      <w:r>
+        <w:t xml:space="preserve">the command sets a</w:t>
+      </w:r>
+      <w:r>
+        <w:t xml:space="preserve"> </w:t>
+      </w:r>
+      <w:r>
+        <w:t xml:space="preserve">non-terminal status with an audit row and rejects terminal/unknown values —</w:t>
+      </w:r>
+      <w:r>
+        <w:t xml:space="preserve"> </w:t>
+      </w:r>
+      <w:r>
+        <w:rPr>
+          <w:rStyle w:val="VerbatimChar"/>
+        </w:rPr>
+        <w:t xml:space="preserve">go test ./cmd/workable-items</w:t>
+      </w:r>
+      <w:r>
+        <w:t xml:space="preserve"> </w:t>
+      </w:r>
+      <w:r>
+        <w:t xml:space="preserve">GREEN; pending conductor verification + close.</w:t>
+      </w:r>
+    </w:p>
+    <w:bookmarkEnd w:id="79"/>
+    <w:bookmarkEnd w:id="80"/>
+    <w:bookmarkEnd w:id="81"/>
     <w:sectPr>
       <w:footnotePr>
         <w:numRestart w:val="eachSect"/>

</xml_diff>

<commit_message>
docs(§11.4.65): regenerate Issues/Fixed exports after TMX-058/060/064 closures
Mechanical re-export — derived artifacts only, no source change.

Co-Authored-By: Claude Opus 4.8 (1M context) <noreply@anthropic.com>
Signed-off-by: Милош Васић <milos85vasic@gmail.com>
</commit_message>
<xml_diff>
--- a/Fixed.docx
+++ b/Fixed.docx
@@ -10,7 +10,7 @@
         <w:t xml:space="preserve">Fixed</w:t>
       </w:r>
     </w:p>
-    <w:bookmarkStart w:id="81" w:name="vasic-digital-tmux--closed-items-tracker"/>
+    <w:bookmarkStart w:id="84" w:name="vasic-digital-tmux--closed-items-tracker"/>
     <w:p>
       <w:pPr>
         <w:pStyle w:val="Heading1"/>
@@ -42377,7 +42377,7 @@
     </w:p>
     <w:bookmarkEnd w:id="71"/>
     <w:bookmarkEnd w:id="72"/>
-    <w:bookmarkStart w:id="80" w:name="d-migration-history--informational"/>
+    <w:bookmarkStart w:id="83" w:name="d-migration-history--informational"/>
     <w:p>
       <w:pPr>
         <w:pStyle w:val="Heading2"/>
@@ -45794,8 +45794,994 @@
       </w:r>
     </w:p>
     <w:bookmarkEnd w:id="79"/>
+    <w:bookmarkStart w:id="80" w:name="Xd47b79b1f50fb2fa2ec14c70174490f89c1d167"/>
+    <w:p>
+      <w:pPr>
+        <w:pStyle w:val="Heading3"/>
+      </w:pPr>
+      <w:r>
+        <w:t xml:space="preserve">A54 NO-SUDO-PROJECTWIDE-FOLLOWUP-001 — convert print-only sudo/setcap hints outside the install path and extend the no-sudo gate project-wide —</w:t>
+      </w:r>
+      <w:r>
+        <w:t xml:space="preserve"> </w:t>
+      </w:r>
+      <w:r>
+        <w:rPr>
+          <w:rStyle w:val="VerbatimChar"/>
+        </w:rPr>
+        <w:t xml:space="preserve">RESOLVED</w:t>
+      </w:r>
+    </w:p>
+    <w:p>
+      <w:pPr>
+        <w:pStyle w:val="FirstParagraph"/>
+      </w:pPr>
+      <w:r>
+        <w:rPr>
+          <w:b/>
+          <w:bCs/>
+        </w:rPr>
+        <w:t xml:space="preserve">TMX-ID:</w:t>
+      </w:r>
+      <w:r>
+        <w:t xml:space="preserve"> </w:t>
+      </w:r>
+      <w:r>
+        <w:t xml:space="preserve">TMX-064</w:t>
+      </w:r>
+      <w:r>
+        <w:t xml:space="preserve"> </w:t>
+      </w:r>
+      <w:r>
+        <w:rPr>
+          <w:b/>
+          <w:bCs/>
+        </w:rPr>
+        <w:t xml:space="preserve">Status:</w:t>
+      </w:r>
+      <w:r>
+        <w:t xml:space="preserve"> </w:t>
+      </w:r>
+      <w:r>
+        <w:t xml:space="preserve">Completed (→ Fixed.md)</w:t>
+      </w:r>
+      <w:r>
+        <w:t xml:space="preserve"> </w:t>
+      </w:r>
+      <w:r>
+        <w:rPr>
+          <w:b/>
+          <w:bCs/>
+        </w:rPr>
+        <w:t xml:space="preserve">Type:</w:t>
+      </w:r>
+      <w:r>
+        <w:t xml:space="preserve"> </w:t>
+      </w:r>
+      <w:r>
+        <w:t xml:space="preserve">Task</w:t>
+      </w:r>
+      <w:r>
+        <w:t xml:space="preserve"> </w:t>
+      </w:r>
+      <w:r>
+        <w:rPr>
+          <w:b/>
+          <w:bCs/>
+        </w:rPr>
+        <w:t xml:space="preserve">Severity:</w:t>
+      </w:r>
+      <w:r>
+        <w:t xml:space="preserve"> </w:t>
+      </w:r>
+      <w:r>
+        <w:t xml:space="preserve">MEDIUM</w:t>
+      </w:r>
+    </w:p>
+    <w:p>
+      <w:pPr>
+        <w:pStyle w:val="BodyText"/>
+      </w:pPr>
+      <w:r>
+        <w:t xml:space="preserve">Follow-up to TMX-062: convert the remaining print-only</w:t>
+      </w:r>
+      <w:r>
+        <w:t xml:space="preserve"> </w:t>
+      </w:r>
+      <w:r>
+        <w:rPr>
+          <w:rStyle w:val="VerbatimChar"/>
+        </w:rPr>
+        <w:t xml:space="preserve">sudo</w:t>
+      </w:r>
+      <w:r>
+        <w:t xml:space="preserve">/</w:t>
+      </w:r>
+      <w:r>
+        <w:rPr>
+          <w:rStyle w:val="VerbatimChar"/>
+        </w:rPr>
+        <w:t xml:space="preserve">setcap</w:t>
+      </w:r>
+      <w:r>
+        <w:t xml:space="preserve"> </w:t>
+      </w:r>
+      <w:r>
+        <w:t xml:space="preserve">hints OUTSIDE the install path (</w:t>
+      </w:r>
+      <w:r>
+        <w:rPr>
+          <w:rStyle w:val="VerbatimChar"/>
+        </w:rPr>
+        <w:t xml:space="preserve">scripts/build_oom_set.sh</w:t>
+      </w:r>
+      <w:r>
+        <w:t xml:space="preserve">,</w:t>
+      </w:r>
+      <w:r>
+        <w:t xml:space="preserve"> </w:t>
+      </w:r>
+      <w:r>
+        <w:rPr>
+          <w:rStyle w:val="VerbatimChar"/>
+        </w:rPr>
+        <w:t xml:space="preserve">scripts/test_vm.sh</w:t>
+      </w:r>
+      <w:r>
+        <w:t xml:space="preserve">,</w:t>
+      </w:r>
+      <w:r>
+        <w:t xml:space="preserve"> </w:t>
+      </w:r>
+      <w:r>
+        <w:rPr>
+          <w:rStyle w:val="VerbatimChar"/>
+        </w:rPr>
+        <w:t xml:space="preserve">scripts/tests/08_oom_score_adj.sh</w:t>
+      </w:r>
+      <w:r>
+        <w:t xml:space="preserve">, and the</w:t>
+      </w:r>
+      <w:r>
+        <w:t xml:space="preserve"> </w:t>
+      </w:r>
+      <w:r>
+        <w:rPr>
+          <w:rStyle w:val="VerbatimChar"/>
+        </w:rPr>
+        <w:t xml:space="preserve">scripts/oom_set.c</w:t>
+      </w:r>
+      <w:r>
+        <w:t xml:space="preserve"> </w:t>
+      </w:r>
+      <w:r>
+        <w:t xml:space="preserve">comment) to "(as root)" phrasing, and extend the no-sudo gate project-wide so it detects</w:t>
+      </w:r>
+      <w:r>
+        <w:t xml:space="preserve"> </w:t>
+      </w:r>
+      <w:r>
+        <w:rPr>
+          <w:rStyle w:val="VerbatimChar"/>
+        </w:rPr>
+        <w:t xml:space="preserve">sudo</w:t>
+      </w:r>
+      <w:r>
+        <w:t xml:space="preserve">/</w:t>
+      </w:r>
+      <w:r>
+        <w:rPr>
+          <w:rStyle w:val="VerbatimChar"/>
+        </w:rPr>
+        <w:t xml:space="preserve">su</w:t>
+      </w:r>
+      <w:r>
+        <w:t xml:space="preserve"> </w:t>
+      </w:r>
+      <w:r>
+        <w:t xml:space="preserve">EXECUTION rather than mere mention. Status Queued. Acceptance: project-wide 0</w:t>
+      </w:r>
+      <w:r>
+        <w:t xml:space="preserve"> </w:t>
+      </w:r>
+      <w:r>
+        <w:rPr>
+          <w:rStyle w:val="VerbatimChar"/>
+        </w:rPr>
+        <w:t xml:space="preserve">sudo</w:t>
+      </w:r>
+      <w:r>
+        <w:t xml:space="preserve">/</w:t>
+      </w:r>
+      <w:r>
+        <w:rPr>
+          <w:rStyle w:val="VerbatimChar"/>
+        </w:rPr>
+        <w:t xml:space="preserve">su</w:t>
+      </w:r>
+      <w:r>
+        <w:t xml:space="preserve"> </w:t>
+      </w:r>
+      <w:r>
+        <w:t xml:space="preserve">execution paths, and the gate is scoped to flag execution only — no false positives on legitimate "(as root)" documentation strings.</w:t>
+      </w:r>
+    </w:p>
     <w:bookmarkEnd w:id="80"/>
+    <w:bookmarkStart w:id="81" w:name="Xc918b86b63525bc420f3c6b2d83b5743c5247cb"/>
+    <w:p>
+      <w:pPr>
+        <w:pStyle w:val="Heading3"/>
+      </w:pPr>
+      <w:r>
+        <w:t xml:space="preserve">B51 DB-FIXEDMD-SSOT-DRIFT-001 — reconcile DB↔Fixed.md SSoT drift (Fixed.md A46-A49 absent from the items table) —</w:t>
+      </w:r>
+      <w:r>
+        <w:t xml:space="preserve"> </w:t>
+      </w:r>
+      <w:r>
+        <w:rPr>
+          <w:rStyle w:val="VerbatimChar"/>
+        </w:rPr>
+        <w:t xml:space="preserve">RESOLVED</w:t>
+      </w:r>
+    </w:p>
+    <w:p>
+      <w:pPr>
+        <w:pStyle w:val="FirstParagraph"/>
+      </w:pPr>
+      <w:r>
+        <w:rPr>
+          <w:b/>
+          <w:bCs/>
+        </w:rPr>
+        <w:t xml:space="preserve">TMX-ID:</w:t>
+      </w:r>
+      <w:r>
+        <w:t xml:space="preserve"> </w:t>
+      </w:r>
+      <w:r>
+        <w:t xml:space="preserve">TMX-060</w:t>
+      </w:r>
+      <w:r>
+        <w:t xml:space="preserve"> </w:t>
+      </w:r>
+      <w:r>
+        <w:rPr>
+          <w:b/>
+          <w:bCs/>
+        </w:rPr>
+        <w:t xml:space="preserve">Status:</w:t>
+      </w:r>
+      <w:r>
+        <w:t xml:space="preserve"> </w:t>
+      </w:r>
+      <w:r>
+        <w:t xml:space="preserve">Completed (→ Fixed.md)</w:t>
+      </w:r>
+      <w:r>
+        <w:t xml:space="preserve"> </w:t>
+      </w:r>
+      <w:r>
+        <w:rPr>
+          <w:b/>
+          <w:bCs/>
+        </w:rPr>
+        <w:t xml:space="preserve">Type:</w:t>
+      </w:r>
+      <w:r>
+        <w:t xml:space="preserve"> </w:t>
+      </w:r>
+      <w:r>
+        <w:t xml:space="preserve">Task</w:t>
+      </w:r>
+      <w:r>
+        <w:t xml:space="preserve"> </w:t>
+      </w:r>
+      <w:r>
+        <w:rPr>
+          <w:b/>
+          <w:bCs/>
+        </w:rPr>
+        <w:t xml:space="preserve">Severity:</w:t>
+      </w:r>
+      <w:r>
+        <w:t xml:space="preserve"> </w:t>
+      </w:r>
+      <w:r>
+        <w:t xml:space="preserve">MEDIUM</w:t>
+      </w:r>
+    </w:p>
+    <w:p>
+      <w:pPr>
+        <w:pStyle w:val="BodyText"/>
+      </w:pPr>
+      <w:r>
+        <w:t xml:space="preserve">The §11.4.93 workable-items DB is missing four RESOLVED</w:t>
+      </w:r>
+      <w:r>
+        <w:t xml:space="preserve"> </w:t>
+      </w:r>
+      <w:r>
+        <w:rPr>
+          <w:rStyle w:val="VerbatimChar"/>
+        </w:rPr>
+        <w:t xml:space="preserve">Fixed.md</w:t>
+      </w:r>
+      <w:r>
+        <w:t xml:space="preserve"> </w:t>
+      </w:r>
+      <w:r>
+        <w:t xml:space="preserve">entries — A46 (libtinfo</w:t>
+      </w:r>
+      <w:r>
+        <w:t xml:space="preserve"> </w:t>
+      </w:r>
+      <w:r>
+        <w:t xml:space="preserve">version warning), A47 (test-harness timing races), A48 (distribution orchestrator binary),</w:t>
+      </w:r>
+      <w:r>
+        <w:t xml:space="preserve"> </w:t>
+      </w:r>
+      <w:r>
+        <w:t xml:space="preserve">A49 (test 17 scrollback load flake). A full</w:t>
+      </w:r>
+      <w:r>
+        <w:t xml:space="preserve"> </w:t>
+      </w:r>
+      <w:r>
+        <w:rPr>
+          <w:rStyle w:val="VerbatimChar"/>
+        </w:rPr>
+        <w:t xml:space="preserve">md-to-db</w:t>
+      </w:r>
+      <w:r>
+        <w:t xml:space="preserve"> </w:t>
+      </w:r>
+      <w:r>
+        <w:t xml:space="preserve">over</w:t>
+      </w:r>
+      <w:r>
+        <w:t xml:space="preserve"> </w:t>
+      </w:r>
+      <w:r>
+        <w:rPr>
+          <w:rStyle w:val="VerbatimChar"/>
+        </w:rPr>
+        <w:t xml:space="preserve">Fixed.md</w:t>
+      </w:r>
+      <w:r>
+        <w:t xml:space="preserve"> </w:t>
+      </w:r>
+      <w:r>
+        <w:t xml:space="preserve">reports</w:t>
+      </w:r>
+      <w:r>
+        <w:t xml:space="preserve"> </w:t>
+      </w:r>
+      <w:r>
+        <w:rPr>
+          <w:rStyle w:val="VerbatimChar"/>
+        </w:rPr>
+        <w:t xml:space="preserve">inserted=4 updated=1 allocated=4</w:t>
+      </w:r>
+      <w:r>
+        <w:t xml:space="preserve">, proving the items table never captured them (the</w:t>
+      </w:r>
+      <w:r>
+        <w:t xml:space="preserve"> </w:t>
+      </w:r>
+      <w:r>
+        <w:t xml:space="preserve">CHANGELOG names this "DB↔Fixed.md SSoT drift" as a tracked follow-up).</w:t>
+      </w:r>
+      <w:r>
+        <w:t xml:space="preserve"> </w:t>
+      </w:r>
+      <w:r>
+        <w:rPr>
+          <w:b/>
+          <w:bCs/>
+        </w:rPr>
+        <w:t xml:space="preserve">Fix direction:</w:t>
+      </w:r>
+      <w:r>
+        <w:t xml:space="preserve"> </w:t>
+      </w:r>
+      <w:r>
+        <w:t xml:space="preserve">reconcile carefully — confirm none are reworded duplicates of an existing id before</w:t>
+      </w:r>
+      <w:r>
+        <w:t xml:space="preserve"> </w:t>
+      </w:r>
+      <w:r>
+        <w:t xml:space="preserve">allocating, identify the</w:t>
+      </w:r>
+      <w:r>
+        <w:t xml:space="preserve"> </w:t>
+      </w:r>
+      <w:r>
+        <w:rPr>
+          <w:rStyle w:val="VerbatimChar"/>
+        </w:rPr>
+        <w:t xml:space="preserve">updated=1</w:t>
+      </w:r>
+      <w:r>
+        <w:t xml:space="preserve"> </w:t>
+      </w:r>
+      <w:r>
+        <w:t xml:space="preserve">item, then sync so</w:t>
+      </w:r>
+      <w:r>
+        <w:t xml:space="preserve"> </w:t>
+      </w:r>
+      <w:r>
+        <w:rPr>
+          <w:rStyle w:val="VerbatimChar"/>
+        </w:rPr>
+        <w:t xml:space="preserve">validate</w:t>
+      </w:r>
+      <w:r>
+        <w:t xml:space="preserve"> </w:t>
+      </w:r>
+      <w:r>
+        <w:t xml:space="preserve">+</w:t>
+      </w:r>
+      <w:r>
+        <w:t xml:space="preserve"> </w:t>
+      </w:r>
+      <w:r>
+        <w:rPr>
+          <w:rStyle w:val="VerbatimChar"/>
+        </w:rPr>
+        <w:t xml:space="preserve">diff</w:t>
+      </w:r>
+      <w:r>
+        <w:t xml:space="preserve"> </w:t>
+      </w:r>
+      <w:r>
+        <w:t xml:space="preserve">stay clean.</w:t>
+      </w:r>
+      <w:r>
+        <w:t xml:space="preserve"> </w:t>
+      </w:r>
+      <w:r>
+        <w:rPr>
+          <w:b/>
+          <w:bCs/>
+        </w:rPr>
+        <w:t xml:space="preserve">Acceptance:</w:t>
+      </w:r>
+      <w:r>
+        <w:t xml:space="preserve"> </w:t>
+      </w:r>
+      <w:r>
+        <w:rPr>
+          <w:rStyle w:val="VerbatimChar"/>
+        </w:rPr>
+        <w:t xml:space="preserve">md-to-db</w:t>
+      </w:r>
+      <w:r>
+        <w:t xml:space="preserve"> </w:t>
+      </w:r>
+      <w:r>
+        <w:t xml:space="preserve">over the full corpus reports</w:t>
+      </w:r>
+      <w:r>
+        <w:t xml:space="preserve"> </w:t>
+      </w:r>
+      <w:r>
+        <w:rPr>
+          <w:rStyle w:val="VerbatimChar"/>
+        </w:rPr>
+        <w:t xml:space="preserve">inserted=0 updated=0</w:t>
+      </w:r>
+      <w:r>
+        <w:t xml:space="preserve"> </w:t>
+      </w:r>
+      <w:r>
+        <w:t xml:space="preserve">(idempotent)</w:t>
+      </w:r>
+      <w:r>
+        <w:t xml:space="preserve"> </w:t>
+      </w:r>
+      <w:r>
+        <w:t xml:space="preserve">and</w:t>
+      </w:r>
+      <w:r>
+        <w:t xml:space="preserve"> </w:t>
+      </w:r>
+      <w:r>
+        <w:rPr>
+          <w:rStyle w:val="VerbatimChar"/>
+        </w:rPr>
+        <w:t xml:space="preserve">validate</w:t>
+      </w:r>
+      <w:r>
+        <w:t xml:space="preserve"> </w:t>
+      </w:r>
+      <w:r>
+        <w:t xml:space="preserve">is 0-findings.</w:t>
+      </w:r>
+      <w:r>
+        <w:t xml:space="preserve"> </w:t>
+      </w:r>
+      <w:r>
+        <w:rPr>
+          <w:b/>
+          <w:bCs/>
+        </w:rPr>
+        <w:t xml:space="preserve">Reconcile (2026-06-29, this session):</w:t>
+      </w:r>
+      <w:r>
+        <w:t xml:space="preserve"> </w:t>
+      </w:r>
+      <w:r>
+        <w:t xml:space="preserve">ran</w:t>
+      </w:r>
+      <w:r>
+        <w:t xml:space="preserve"> </w:t>
+      </w:r>
+      <w:r>
+        <w:rPr>
+          <w:rStyle w:val="VerbatimChar"/>
+        </w:rPr>
+        <w:t xml:space="preserve">sync md-to-db</w:t>
+      </w:r>
+      <w:r>
+        <w:t xml:space="preserve"> </w:t>
+      </w:r>
+      <w:r>
+        <w:t xml:space="preserve">over the full corpus — the</w:t>
+      </w:r>
+      <w:r>
+        <w:t xml:space="preserve"> </w:t>
+      </w:r>
+      <w:r>
+        <w:t xml:space="preserve">four entries ingested as TMX-067 (A49 → Completed), TMX-068 (A48 → Implemented), TMX-069</w:t>
+      </w:r>
+      <w:r>
+        <w:t xml:space="preserve"> </w:t>
+      </w:r>
+      <w:r>
+        <w:t xml:space="preserve">(A46 → Fixed) and TMX-070 (A47 → Fixed); the</w:t>
+      </w:r>
+      <w:r>
+        <w:t xml:space="preserve"> </w:t>
+      </w:r>
+      <w:r>
+        <w:rPr>
+          <w:rStyle w:val="VerbatimChar"/>
+        </w:rPr>
+        <w:t xml:space="preserve">updated=1</w:t>
+      </w:r>
+      <w:r>
+        <w:t xml:space="preserve"> </w:t>
+      </w:r>
+      <w:r>
+        <w:t xml:space="preserve">item was TMX-045 ("Per-host-topology</w:t>
+      </w:r>
+      <w:r>
+        <w:t xml:space="preserve"> </w:t>
+      </w:r>
+      <w:r>
+        <w:t xml:space="preserve">dispatch probe") whose stored</w:t>
+      </w:r>
+      <w:r>
+        <w:t xml:space="preserve"> </w:t>
+      </w:r>
+      <w:r>
+        <w:rPr>
+          <w:rStyle w:val="VerbatimChar"/>
+        </w:rPr>
+        <w:t xml:space="preserve">raw_body</w:t>
+      </w:r>
+      <w:r>
+        <w:t xml:space="preserve"> </w:t>
+      </w:r>
+      <w:r>
+        <w:t xml:space="preserve">was stale (2140→7648 chars) and was refreshed from</w:t>
+      </w:r>
+      <w:r>
+        <w:t xml:space="preserve"> </w:t>
+      </w:r>
+      <w:r>
+        <w:t xml:space="preserve">the current</w:t>
+      </w:r>
+      <w:r>
+        <w:t xml:space="preserve"> </w:t>
+      </w:r>
+      <w:r>
+        <w:rPr>
+          <w:rStyle w:val="VerbatimChar"/>
+        </w:rPr>
+        <w:t xml:space="preserve">Fixed.md</w:t>
+      </w:r>
+      <w:r>
+        <w:t xml:space="preserve"> </w:t>
+      </w:r>
+      <w:r>
+        <w:t xml:space="preserve">— no other field changed, so it is not a reworded duplicate. The run</w:t>
+      </w:r>
+      <w:r>
+        <w:t xml:space="preserve"> </w:t>
+      </w:r>
+      <w:r>
+        <w:t xml:space="preserve">also re-captured the stale</w:t>
+      </w:r>
+      <w:r>
+        <w:t xml:space="preserve"> </w:t>
+      </w:r>
+      <w:r>
+        <w:rPr>
+          <w:rStyle w:val="VerbatimChar"/>
+        </w:rPr>
+        <w:t xml:space="preserve">document_sources[Fixed]</w:t>
+      </w:r>
+      <w:r>
+        <w:t xml:space="preserve"> </w:t>
+      </w:r>
+      <w:r>
+        <w:t xml:space="preserve">so a future</w:t>
+      </w:r>
+      <w:r>
+        <w:t xml:space="preserve"> </w:t>
+      </w:r>
+      <w:r>
+        <w:rPr>
+          <w:rStyle w:val="VerbatimChar"/>
+        </w:rPr>
+        <w:t xml:space="preserve">db-to-md</w:t>
+      </w:r>
+      <w:r>
+        <w:t xml:space="preserve"> </w:t>
+      </w:r>
+      <w:r>
+        <w:t xml:space="preserve">no longer</w:t>
+      </w:r>
+      <w:r>
+        <w:t xml:space="preserve"> </w:t>
+      </w:r>
+      <w:r>
+        <w:t xml:space="preserve">regresses</w:t>
+      </w:r>
+      <w:r>
+        <w:t xml:space="preserve"> </w:t>
+      </w:r>
+      <w:r>
+        <w:rPr>
+          <w:rStyle w:val="VerbatimChar"/>
+        </w:rPr>
+        <w:t xml:space="preserve">Fixed.md</w:t>
+      </w:r>
+      <w:r>
+        <w:t xml:space="preserve">. A second</w:t>
+      </w:r>
+      <w:r>
+        <w:t xml:space="preserve"> </w:t>
+      </w:r>
+      <w:r>
+        <w:rPr>
+          <w:rStyle w:val="VerbatimChar"/>
+        </w:rPr>
+        <w:t xml:space="preserve">md-to-db</w:t>
+      </w:r>
+      <w:r>
+        <w:t xml:space="preserve"> </w:t>
+      </w:r>
+      <w:r>
+        <w:t xml:space="preserve">reports</w:t>
+      </w:r>
+      <w:r>
+        <w:t xml:space="preserve"> </w:t>
+      </w:r>
+      <w:r>
+        <w:rPr>
+          <w:rStyle w:val="VerbatimChar"/>
+        </w:rPr>
+        <w:t xml:space="preserve">inserted=0 updated=0</w:t>
+      </w:r>
+      <w:r>
+        <w:t xml:space="preserve"> </w:t>
+      </w:r>
+      <w:r>
+        <w:t xml:space="preserve">(idempotent) and</w:t>
+      </w:r>
+      <w:r>
+        <w:t xml:space="preserve"> </w:t>
+      </w:r>
+      <w:r>
+        <w:rPr>
+          <w:rStyle w:val="VerbatimChar"/>
+        </w:rPr>
+        <w:t xml:space="preserve">validate</w:t>
+      </w:r>
+      <w:r>
+        <w:t xml:space="preserve"> </w:t>
+      </w:r>
+      <w:r>
+        <w:t xml:space="preserve">is 0-findings — pending conductor verification + close.</w:t>
+      </w:r>
+    </w:p>
     <w:bookmarkEnd w:id="81"/>
+    <w:bookmarkStart w:id="82" w:name="Xb5ae92cba4a4d3d160811db407a542367fc6a04"/>
+    <w:p>
+      <w:pPr>
+        <w:pStyle w:val="Heading3"/>
+      </w:pPr>
+      <w:r>
+        <w:t xml:space="preserve">E50 INSTALL-DOC-PODMAN-HTTPS-001 — document the rootless-Podman subuid fix and the curl-installer HTTPS-rewrite edge —</w:t>
+      </w:r>
+      <w:r>
+        <w:t xml:space="preserve"> </w:t>
+      </w:r>
+      <w:r>
+        <w:rPr>
+          <w:rStyle w:val="VerbatimChar"/>
+        </w:rPr>
+        <w:t xml:space="preserve">RESOLVED</w:t>
+      </w:r>
+    </w:p>
+    <w:p>
+      <w:pPr>
+        <w:pStyle w:val="FirstParagraph"/>
+      </w:pPr>
+      <w:r>
+        <w:rPr>
+          <w:b/>
+          <w:bCs/>
+        </w:rPr>
+        <w:t xml:space="preserve">TMX-ID:</w:t>
+      </w:r>
+      <w:r>
+        <w:t xml:space="preserve"> </w:t>
+      </w:r>
+      <w:r>
+        <w:t xml:space="preserve">TMX-058</w:t>
+      </w:r>
+      <w:r>
+        <w:t xml:space="preserve"> </w:t>
+      </w:r>
+      <w:r>
+        <w:rPr>
+          <w:b/>
+          <w:bCs/>
+        </w:rPr>
+        <w:t xml:space="preserve">Status:</w:t>
+      </w:r>
+      <w:r>
+        <w:t xml:space="preserve"> </w:t>
+      </w:r>
+      <w:r>
+        <w:t xml:space="preserve">Completed (→ Fixed.md)</w:t>
+      </w:r>
+      <w:r>
+        <w:t xml:space="preserve"> </w:t>
+      </w:r>
+      <w:r>
+        <w:rPr>
+          <w:b/>
+          <w:bCs/>
+        </w:rPr>
+        <w:t xml:space="preserve">Type:</w:t>
+      </w:r>
+      <w:r>
+        <w:t xml:space="preserve"> </w:t>
+      </w:r>
+      <w:r>
+        <w:t xml:space="preserve">Task</w:t>
+      </w:r>
+      <w:r>
+        <w:t xml:space="preserve"> </w:t>
+      </w:r>
+      <w:r>
+        <w:rPr>
+          <w:b/>
+          <w:bCs/>
+        </w:rPr>
+        <w:t xml:space="preserve">Severity:</w:t>
+      </w:r>
+      <w:r>
+        <w:t xml:space="preserve"> </w:t>
+      </w:r>
+      <w:r>
+        <w:t xml:space="preserve">LOW</w:t>
+      </w:r>
+    </w:p>
+    <w:p>
+      <w:pPr>
+        <w:pStyle w:val="BodyText"/>
+      </w:pPr>
+      <w:r>
+        <w:t xml:space="preserve">v1.0.30 shipped a native-build fallback when rootless Podman exhausts</w:t>
+      </w:r>
+      <w:r>
+        <w:t xml:space="preserve"> </w:t>
+      </w:r>
+      <w:r>
+        <w:rPr>
+          <w:rStyle w:val="VerbatimChar"/>
+        </w:rPr>
+        <w:t xml:space="preserve">/etc/subuid</w:t>
+      </w:r>
+      <w:r>
+        <w:t xml:space="preserve"> </w:t>
+      </w:r>
+      <w:r>
+        <w:t xml:space="preserve">+</w:t>
+      </w:r>
+      <w:r>
+        <w:t xml:space="preserve"> </w:t>
+      </w:r>
+      <w:r>
+        <w:rPr>
+          <w:rStyle w:val="VerbatimChar"/>
+        </w:rPr>
+        <w:t xml:space="preserve">/etc/subgid</w:t>
+      </w:r>
+      <w:r>
+        <w:t xml:space="preserve"> </w:t>
+      </w:r>
+      <w:r>
+        <w:t xml:space="preserve">(</w:t>
+      </w:r>
+      <w:r>
+        <w:rPr>
+          <w:rStyle w:val="VerbatimChar"/>
+        </w:rPr>
+        <w:t xml:space="preserve">lchown … invalid argument</w:t>
+      </w:r>
+      <w:r>
+        <w:t xml:space="preserve">) and a</w:t>
+      </w:r>
+      <w:r>
+        <w:t xml:space="preserve"> </w:t>
+      </w:r>
+      <w:r>
+        <w:rPr>
+          <w:rStyle w:val="VerbatimChar"/>
+        </w:rPr>
+        <w:t xml:space="preserve">curl</w:t>
+      </w:r>
+      <w:r>
+        <w:t xml:space="preserve"> </w:t>
+      </w:r>
+      <w:r>
+        <w:t xml:space="preserve">one-liner installer, but the</w:t>
+      </w:r>
+      <w:r>
+        <w:t xml:space="preserve"> </w:t>
+      </w:r>
+      <w:r>
+        <w:t xml:space="preserve">operator-facing repair guidance lives only in the CHANGELOG.</w:t>
+      </w:r>
+      <w:r>
+        <w:t xml:space="preserve"> </w:t>
+      </w:r>
+      <w:r>
+        <w:rPr>
+          <w:b/>
+          <w:bCs/>
+        </w:rPr>
+        <w:t xml:space="preserve">Fix direction:</w:t>
+      </w:r>
+      <w:r>
+        <w:t xml:space="preserve"> </w:t>
+      </w:r>
+      <w:r>
+        <w:t xml:space="preserve">document the</w:t>
+      </w:r>
+      <w:r>
+        <w:t xml:space="preserve"> </w:t>
+      </w:r>
+      <w:r>
+        <w:rPr>
+          <w:rStyle w:val="VerbatimChar"/>
+        </w:rPr>
+        <w:t xml:space="preserve">usermod --add-subuids/--add-subgids</w:t>
+      </w:r>
+      <w:r>
+        <w:t xml:space="preserve"> </w:t>
+      </w:r>
+      <w:r>
+        <w:t xml:space="preserve">+</w:t>
+      </w:r>
+      <w:r>
+        <w:t xml:space="preserve"> </w:t>
+      </w:r>
+      <w:r>
+        <w:rPr>
+          <w:rStyle w:val="VerbatimChar"/>
+        </w:rPr>
+        <w:t xml:space="preserve">podman system migrate</w:t>
+      </w:r>
+      <w:r>
+        <w:t xml:space="preserve"> </w:t>
+      </w:r>
+      <w:r>
+        <w:t xml:space="preserve">repair recipe AND the</w:t>
+      </w:r>
+      <w:r>
+        <w:t xml:space="preserve"> </w:t>
+      </w:r>
+      <w:r>
+        <w:t xml:space="preserve">install HTTPS-rewrite edge in</w:t>
+      </w:r>
+      <w:r>
+        <w:t xml:space="preserve"> </w:t>
+      </w:r>
+      <w:r>
+        <w:rPr>
+          <w:rStyle w:val="VerbatimChar"/>
+        </w:rPr>
+        <w:t xml:space="preserve">docs/guides</w:t>
+      </w:r>
+      <w:r>
+        <w:t xml:space="preserve"> </w:t>
+      </w:r>
+      <w:r>
+        <w:t xml:space="preserve">+</w:t>
+      </w:r>
+      <w:r>
+        <w:t xml:space="preserve"> </w:t>
+      </w:r>
+      <w:r>
+        <w:rPr>
+          <w:rStyle w:val="VerbatimChar"/>
+        </w:rPr>
+        <w:t xml:space="preserve">docs/scripts</w:t>
+      </w:r>
+      <w:r>
+        <w:t xml:space="preserve"> </w:t>
+      </w:r>
+      <w:r>
+        <w:t xml:space="preserve">so an end user hitting either</w:t>
+      </w:r>
+      <w:r>
+        <w:t xml:space="preserve"> </w:t>
+      </w:r>
+      <w:r>
+        <w:t xml:space="preserve">can self-recover.</w:t>
+      </w:r>
+      <w:r>
+        <w:t xml:space="preserve"> </w:t>
+      </w:r>
+      <w:r>
+        <w:rPr>
+          <w:b/>
+          <w:bCs/>
+        </w:rPr>
+        <w:t xml:space="preserve">Acceptance:</w:t>
+      </w:r>
+      <w:r>
+        <w:t xml:space="preserve"> </w:t>
+      </w:r>
+      <w:r>
+        <w:t xml:space="preserve">a docs page (synced HTML/PDF per §11.4.65) reproduces the</w:t>
+      </w:r>
+      <w:r>
+        <w:t xml:space="preserve"> </w:t>
+      </w:r>
+      <w:r>
+        <w:t xml:space="preserve">repair steps, verified against the v1.0.30</w:t>
+      </w:r>
+      <w:r>
+        <w:t xml:space="preserve"> </w:t>
+      </w:r>
+      <w:r>
+        <w:rPr>
+          <w:rStyle w:val="VerbatimChar"/>
+        </w:rPr>
+        <w:t xml:space="preserve">setup.sh</w:t>
+      </w:r>
+      <w:r>
+        <w:t xml:space="preserve"> </w:t>
+      </w:r>
+      <w:r>
+        <w:t xml:space="preserve">fallback path.</w:t>
+      </w:r>
+    </w:p>
+    <w:bookmarkEnd w:id="82"/>
+    <w:bookmarkEnd w:id="83"/>
+    <w:bookmarkEnd w:id="84"/>
     <w:sectPr>
       <w:footnotePr>
         <w:numRestart w:val="eachSect"/>

</xml_diff>

<commit_message>
docs(tmux v1.0.43): backfill TMX-084/TMX-085 closure SHA in Fixed.md
Fixed.md §K1/§K2's 'Closure commit: (this commit)' placeholders
backfilled with e6c0c1c (the TMX-084/TMX-085 commit), per this
project's established pattern (20 pre-existing occurrences use the
same convention).

Classification: project-specific (doc-sync for an already-committed
fix) per §11.4.17.

Signed-off-by: Милош Васић <milos85vasic@gmail.com>
</commit_message>
<xml_diff>
--- a/Fixed.docx
+++ b/Fixed.docx
@@ -53784,7 +53784,10 @@
         <w:t xml:space="preserve"> </w:t>
       </w:r>
       <w:r>
-        <w:t xml:space="preserve">(this commit)</w:t>
+        <w:rPr>
+          <w:rStyle w:val="VerbatimChar"/>
+        </w:rPr>
+        <w:t xml:space="preserve">e6c0c1c</w:t>
       </w:r>
       <w:r>
         <w:t xml:space="preserve"> </w:t>
@@ -54616,7 +54619,10 @@
         <w:t xml:space="preserve"> </w:t>
       </w:r>
       <w:r>
-        <w:t xml:space="preserve">(this commit)</w:t>
+        <w:rPr>
+          <w:rStyle w:val="VerbatimChar"/>
+        </w:rPr>
+        <w:t xml:space="preserve">e6c0c1c</w:t>
       </w:r>
       <w:r>
         <w:t xml:space="preserve"> </w:t>

</xml_diff>